<commit_message>
Updated Documents for week 5
</commit_message>
<xml_diff>
--- a/documents/Component Decision Document.docx
+++ b/documents/Component Decision Document.docx
@@ -43,7 +43,15 @@
         <w:t>-F</w:t>
       </w:r>
       <w:r>
-        <w:t>i support(Suggested, ESP32</w:t>
+        <w:t xml:space="preserve">i </w:t>
+      </w:r>
+      <w:proofErr w:type="gramStart"/>
+      <w:r>
+        <w:t>support(</w:t>
+      </w:r>
+      <w:proofErr w:type="gramEnd"/>
+      <w:r>
+        <w:t>Suggested, ESP32</w:t>
       </w:r>
       <w:r>
         <w:t>-C6(</w:t>
@@ -53,12 +61,9 @@
           <w:rPr>
             <w:rStyle w:val="Hyperlink"/>
           </w:rPr>
-          <w:t>https://www.digikey.com/en/products/detail/espressif-systems/ESP32-C6-DEVKITC-1-N8/17728861?gclsrc=aw.ds&amp;gad_source=1&amp;gad_campaignid=20243136172&amp;gclid=Cj0KCQjwt9jVBhDXARIsAFSP-6dbMkKPJuASEpyhKmfW5LCMDCh26W95TRwu1P5mEe1wB0qSs7zGIT0aAt--EALw_wcB</w:t>
+          <w:t>https://www.digikey.com/en/products/detail/espressif-systems/ESP32-C6FH4/18587545</w:t>
         </w:r>
       </w:hyperlink>
-      <w:r>
-        <w:t xml:space="preserve"> </w:t>
-      </w:r>
       <w:r>
         <w:t>)</w:t>
       </w:r>
@@ -103,6 +108,68 @@
       </w:r>
       <w:r>
         <w:t>Must Have a Fast lead time</w:t>
+      </w:r>
+    </w:p>
+    <w:p>
+      <w:r>
+        <w:t>Voltage Regulator:</w:t>
+      </w:r>
+    </w:p>
+    <w:p>
+      <w:r>
+        <w:t>Chosen for affordability:</w:t>
+      </w:r>
+      <w:r>
+        <w:br/>
+      </w:r>
+      <w:hyperlink r:id="rId5" w:history="1">
+        <w:r>
+          <w:rPr>
+            <w:rStyle w:val="Hyperlink"/>
+          </w:rPr>
+          <w:t>https://www.digikey.com/en/products/detail/onsemi/NCP1117ST33T3</w:t>
+        </w:r>
+        <w:r>
+          <w:rPr>
+            <w:rStyle w:val="Hyperlink"/>
+          </w:rPr>
+          <w:t>G</w:t>
+        </w:r>
+        <w:r>
+          <w:rPr>
+            <w:rStyle w:val="Hyperlink"/>
+          </w:rPr>
+          <w:t>/1749063</w:t>
+        </w:r>
+      </w:hyperlink>
+      <w:r>
+        <w:t xml:space="preserve"> </w:t>
+      </w:r>
+    </w:p>
+    <w:p>
+      <w:r>
+        <w:t xml:space="preserve">Chosen for Short lead time compared to </w:t>
+      </w:r>
+      <w:proofErr w:type="gramStart"/>
+      <w:r>
+        <w:t>others(</w:t>
+      </w:r>
+      <w:proofErr w:type="gramEnd"/>
+      <w:r>
+        <w:t>29 weeks yikes)</w:t>
+      </w:r>
+    </w:p>
+    <w:p>
+      <w:hyperlink r:id="rId6" w:history="1">
+        <w:r>
+          <w:rPr>
+            <w:rStyle w:val="Hyperlink"/>
+          </w:rPr>
+          <w:t>https://www.ti.com/lit/ds/symlink/opt3002.pdf?HQS=dis-dk-null-digikeymode-dsf-pf-null-wwe&amp;ts=1790522989225&amp;ref_url=https%253A%252F%252Fwww.ti.com%252Fgeneral%252Fdocs%252Fsuppproductinfo.tsp%253FdistId%253D10%2526gotoUrl%253Dhttps%253A%252F%252Fwww.ti.com%252Flit%252Fgpn%252Fopt3002</w:t>
+        </w:r>
+      </w:hyperlink>
+      <w:r>
+        <w:t xml:space="preserve"> </w:t>
       </w:r>
     </w:p>
     <w:p/>
@@ -138,10 +205,46 @@
     </w:p>
     <w:p>
       <w:pPr>
-        <w:ind w:firstLine="720"/>
+        <w:ind w:left="720" w:firstLine="720"/>
       </w:pPr>
       <w:r>
-        <w:t>-Light</w:t>
+        <w:t>-</w:t>
+      </w:r>
+      <w:r>
+        <w:t xml:space="preserve"> </w:t>
+      </w:r>
+      <w:hyperlink r:id="rId7" w:history="1">
+        <w:r>
+          <w:rPr>
+            <w:rStyle w:val="Hyperlink"/>
+          </w:rPr>
+          <w:t>https://www.ti.com/lit/ds/symlink/tmp110.pdf</w:t>
+        </w:r>
+      </w:hyperlink>
+      <w:r>
+        <w:t xml:space="preserve"> (Great sensor! Has a long lead time though.)</w:t>
+      </w:r>
+    </w:p>
+    <w:p>
+      <w:pPr>
+        <w:ind w:left="720" w:firstLine="720"/>
+      </w:pPr>
+      <w:r>
+        <w:t>-</w:t>
+      </w:r>
+      <w:r>
+        <w:t xml:space="preserve"> </w:t>
+      </w:r>
+      <w:hyperlink r:id="rId8" w:history="1">
+        <w:r>
+          <w:rPr>
+            <w:rStyle w:val="Hyperlink"/>
+          </w:rPr>
+          <w:t>https://www.digikey.com/en/products/detail/microchip-technology/MCP9700BT-H-TT/17631010</w:t>
+        </w:r>
+      </w:hyperlink>
+      <w:r>
+        <w:t xml:space="preserve"> (also great, better lead time.)</w:t>
       </w:r>
     </w:p>
     <w:p>
@@ -149,7 +252,54 @@
         <w:ind w:firstLine="720"/>
       </w:pPr>
       <w:r>
+        <w:t>-Light</w:t>
+      </w:r>
+    </w:p>
+    <w:p>
+      <w:pPr>
+        <w:ind w:firstLine="720"/>
+      </w:pPr>
+      <w:r>
+        <w:tab/>
+      </w:r>
+      <w:hyperlink r:id="rId9" w:history="1">
+        <w:r>
+          <w:rPr>
+            <w:rStyle w:val="Hyperlink"/>
+          </w:rPr>
+          <w:t>https://www.ti.com/product/OPT3002?utm_source=google&amp;utm_medium=cpc&amp;utm_campaign=asc-null-null-GPN_EN-cpc-pf-google-ww_en_cons&amp;utm_content=OPT3002&amp;ds_k=OPT3002&amp;DCM=yes&amp;gclsrc=aw.ds&amp;gad_source=1&amp;gad_campaignid=14388345080&amp;gclid=CjwKCAjw_eLVBhBEEiwAeaYZfG9gtpCmINCfZSqEWpRabwRdA2KxRol5ZQa8VSye5d-_s1dJw1n5vhoCCB0QAvD_BwE</w:t>
+        </w:r>
+      </w:hyperlink>
+      <w:r>
+        <w:t xml:space="preserve"> </w:t>
+      </w:r>
+    </w:p>
+    <w:p>
+      <w:pPr>
+        <w:ind w:firstLine="720"/>
+      </w:pPr>
+      <w:r>
+        <w:lastRenderedPageBreak/>
         <w:t>-PIR</w:t>
+      </w:r>
+    </w:p>
+    <w:p>
+      <w:pPr>
+        <w:ind w:left="720" w:firstLine="720"/>
+      </w:pPr>
+      <w:r>
+        <w:t xml:space="preserve">-only cheap one with reasonable lead time and range: </w:t>
+      </w:r>
+      <w:hyperlink r:id="rId10" w:history="1">
+        <w:r>
+          <w:rPr>
+            <w:rStyle w:val="Hyperlink"/>
+          </w:rPr>
+          <w:t>https://www.digikey.com/en/products/detail/adafruit-industries-llc/4666/13175534</w:t>
+        </w:r>
+      </w:hyperlink>
+      <w:r>
+        <w:t xml:space="preserve"> </w:t>
       </w:r>
     </w:p>
     <w:sectPr>
@@ -765,7 +915,6 @@
   <w:style w:type="character" w:default="1" w:styleId="DefaultParagraphFont">
     <w:name w:val="Default Paragraph Font"/>
     <w:uiPriority w:val="1"/>
-    <w:semiHidden/>
     <w:unhideWhenUsed/>
   </w:style>
   <w:style w:type="table" w:default="1" w:styleId="TableNormal">
@@ -1100,6 +1249,18 @@
     <w:rPr>
       <w:color w:val="605E5C"/>
       <w:shd w:val="clear" w:color="auto" w:fill="E1DFDD"/>
+    </w:rPr>
+  </w:style>
+  <w:style w:type="character" w:styleId="FollowedHyperlink">
+    <w:name w:val="FollowedHyperlink"/>
+    <w:basedOn w:val="DefaultParagraphFont"/>
+    <w:uiPriority w:val="99"/>
+    <w:semiHidden/>
+    <w:unhideWhenUsed/>
+    <w:rsid w:val="00C8490A"/>
+    <w:rPr>
+      <w:color w:val="96607D" w:themeColor="followedHyperlink"/>
+      <w:u w:val="single"/>
     </w:rPr>
   </w:style>
 </w:styles>

</xml_diff>